<commit_message>
adding client.py to working dir as user needs it
</commit_message>
<xml_diff>
--- a/personal_works/MS/usage.docx
+++ b/personal_works/MS/usage.docx
@@ -249,6 +249,52 @@
     </w:p>
     <w:p>
       <w:pPr>
+        <w:pStyle w:val="ListParagraph"/>
+        <w:numPr>
+          <w:ilvl w:val="0"/>
+          <w:numId w:val="1"/>
+        </w:numPr>
+        <w:rPr>
+          <w:lang w:val="en-US"/>
+        </w:rPr>
+      </w:pPr>
+      <w:r>
+        <w:rPr>
+          <w:lang w:val="en-US"/>
+        </w:rPr>
+        <w:t xml:space="preserve">You might have to install </w:t>
+      </w:r>
+      <w:proofErr w:type="spellStart"/>
+      <w:r>
+        <w:rPr>
+          <w:lang w:val="en-US"/>
+        </w:rPr>
+        <w:t>lxml</w:t>
+      </w:r>
+      <w:proofErr w:type="spellEnd"/>
+      <w:r>
+        <w:rPr>
+          <w:lang w:val="en-US"/>
+        </w:rPr>
+        <w:t xml:space="preserve"> and </w:t>
+      </w:r>
+      <w:proofErr w:type="spellStart"/>
+      <w:r>
+        <w:rPr>
+          <w:lang w:val="en-US"/>
+        </w:rPr>
+        <w:t>websockets</w:t>
+      </w:r>
+      <w:proofErr w:type="spellEnd"/>
+      <w:r>
+        <w:rPr>
+          <w:lang w:val="en-US"/>
+        </w:rPr>
+        <w:t xml:space="preserve"> if not already installed</w:t>
+      </w:r>
+    </w:p>
+    <w:p>
+      <w:pPr>
         <w:pStyle w:val="Heading1"/>
         <w:rPr>
           <w:lang w:val="en-US"/>
@@ -6064,10 +6110,7 @@
         <w:t xml:space="preserve">They can point to the same MS binaries or different. It can be different because </w:t>
       </w:r>
       <w:r>
-        <w:t>ALTAIR_HOME</w:t>
-      </w:r>
-      <w:r>
-        <w:t xml:space="preserve"> absolutely needs to have the python and HW installation set up which is referred to as</w:t>
+        <w:t>ALTAIR_HOME absolutely needs to have the python and HW installation set up which is referred to as</w:t>
       </w:r>
     </w:p>
     <w:p>
@@ -6093,61 +6136,378 @@
     </w:p>
     <w:p>
       <w:r>
-        <w:t>set PYTHONHOME=%ALTAIR_HOME%\common\python\python3.8\win64</w:t>
-      </w:r>
-      <w:r>
+        <w:t xml:space="preserve">set PYTHONHOME=%ALTAIR_HOME%\common\python\python3.8\win64 </w:t>
+      </w:r>
+    </w:p>
+    <w:p>
+      <w:r>
+        <w:t>The</w:t>
+      </w:r>
+      <w:r>
+        <w:t xml:space="preserve"> ALTAIR_INSTALLATION is used for setting the run time binaries for the MS run alone</w:t>
+      </w:r>
+    </w:p>
+    <w:p>
+      <w:r>
+        <w:t xml:space="preserve">You need </w:t>
+      </w:r>
+      <w:proofErr w:type="gramStart"/>
+      <w:r>
+        <w:t>to  add</w:t>
+      </w:r>
+      <w:proofErr w:type="gramEnd"/>
+      <w:r>
+        <w:t xml:space="preserve"> your model as per the </w:t>
+      </w:r>
+      <w:proofErr w:type="spellStart"/>
+      <w:r>
+        <w:t>nuqa</w:t>
+      </w:r>
+      <w:proofErr w:type="spellEnd"/>
+      <w:r>
+        <w:t xml:space="preserve"> working methodology which is to add it to a xml in </w:t>
+      </w:r>
+      <w:proofErr w:type="spellStart"/>
+      <w:r>
+        <w:t>qa_cmd</w:t>
+      </w:r>
+      <w:proofErr w:type="spellEnd"/>
+      <w:r>
+        <w:t xml:space="preserve"> and provide its supporting files. And then provide the model id in the </w:t>
+      </w:r>
+      <w:proofErr w:type="spellStart"/>
+      <w:r>
+        <w:t>nuqa</w:t>
+      </w:r>
+      <w:proofErr w:type="spellEnd"/>
+      <w:r>
+        <w:t xml:space="preserve"> command in the bat file</w:t>
+      </w:r>
+    </w:p>
+    <w:p>
+      <w:pPr>
+        <w:pStyle w:val="Heading2"/>
+        <w:rPr>
+          <w:lang w:val="en-US"/>
+        </w:rPr>
+      </w:pPr>
+      <w:r>
+        <w:t>Start</w:t>
+      </w:r>
+      <w:r>
+        <w:rPr>
+          <w:lang w:val="en-US"/>
+        </w:rPr>
         <w:t xml:space="preserve"> </w:t>
       </w:r>
-    </w:p>
-    <w:p>
-      <w:r>
-        <w:t>The</w:t>
-      </w:r>
-      <w:r>
+      <w:proofErr w:type="spellStart"/>
+      <w:r>
+        <w:rPr>
+          <w:lang w:val="en-US"/>
+        </w:rPr>
+        <w:t>websocket</w:t>
+      </w:r>
+      <w:proofErr w:type="spellEnd"/>
+    </w:p>
+    <w:p>
+      <w:pPr>
+        <w:rPr>
+          <w:lang w:val="en-US"/>
+        </w:rPr>
+      </w:pPr>
+      <w:r>
+        <w:rPr>
+          <w:lang w:val="en-US"/>
+        </w:rPr>
+        <w:t xml:space="preserve">Open command terminal. Use a </w:t>
+      </w:r>
+      <w:proofErr w:type="gramStart"/>
+      <w:r>
+        <w:rPr>
+          <w:lang w:val="en-US"/>
+        </w:rPr>
+        <w:t>long term</w:t>
+      </w:r>
+      <w:proofErr w:type="gramEnd"/>
+      <w:r>
+        <w:rPr>
+          <w:lang w:val="en-US"/>
+        </w:rPr>
+        <w:t xml:space="preserve"> release version of latest python like 3.10 or 3.11. Or use the python from Altair’s installation </w:t>
+      </w:r>
+      <w:r>
+        <w:rPr>
+          <w:lang w:val="en-US"/>
+        </w:rPr>
+        <w:t xml:space="preserve">located at </w:t>
+      </w:r>
+      <w:r>
+        <w:rPr>
+          <w:lang w:val="en-US"/>
+        </w:rPr>
+        <w:t>common\python\python3.10\win64</w:t>
+      </w:r>
+    </w:p>
+    <w:p>
+      <w:pPr>
+        <w:rPr>
+          <w:lang w:val="en-US"/>
+        </w:rPr>
+      </w:pPr>
+      <w:r>
+        <w:rPr>
+          <w:lang w:val="en-US"/>
+        </w:rPr>
+        <w:t>In terminal:</w:t>
+      </w:r>
+    </w:p>
+    <w:p>
+      <w:pPr>
+        <w:rPr>
+          <w:lang w:val="en-US"/>
+        </w:rPr>
+      </w:pPr>
+      <w:r>
+        <w:rPr>
+          <w:lang w:val="en-US"/>
+        </w:rPr>
+        <w:t xml:space="preserve">Cd </w:t>
+      </w:r>
+      <w:proofErr w:type="spellStart"/>
+      <w:r>
+        <w:rPr>
+          <w:lang w:val="en-US"/>
+        </w:rPr>
+        <w:t>location_to_work_dire</w:t>
+      </w:r>
+      <w:proofErr w:type="spellEnd"/>
+    </w:p>
+    <w:p>
+      <w:pPr>
+        <w:rPr>
+          <w:lang w:val="en-US"/>
+        </w:rPr>
+      </w:pPr>
+      <w:r>
+        <w:rPr>
+          <w:lang w:val="en-US"/>
+        </w:rPr>
+        <w:t>E:\install\2026_0_16</w:t>
+      </w:r>
+      <w:r>
+        <w:rPr>
+          <w:lang w:val="en-US"/>
+        </w:rPr>
+        <w:t>\</w:t>
+      </w:r>
+      <w:r>
+        <w:rPr>
+          <w:lang w:val="en-US"/>
+        </w:rPr>
         <w:t xml:space="preserve"> </w:t>
       </w:r>
       <w:r>
-        <w:t>ALTAIR_INSTALLATION</w:t>
-      </w:r>
-      <w:r>
-        <w:t xml:space="preserve"> is used for setting the run time binaries for the MS run alone</w:t>
-      </w:r>
-    </w:p>
-    <w:p>
-      <w:r>
-        <w:t xml:space="preserve">You need </w:t>
-      </w:r>
-      <w:proofErr w:type="gramStart"/>
-      <w:r>
-        <w:t>to  add</w:t>
-      </w:r>
-      <w:proofErr w:type="gramEnd"/>
-      <w:r>
-        <w:t xml:space="preserve"> your model as per the </w:t>
-      </w:r>
-      <w:proofErr w:type="spellStart"/>
-      <w:r>
-        <w:t>nuqa</w:t>
-      </w:r>
-      <w:proofErr w:type="spellEnd"/>
-      <w:r>
-        <w:t xml:space="preserve"> working methodology which is to add it to a xml in </w:t>
-      </w:r>
-      <w:proofErr w:type="spellStart"/>
-      <w:r>
-        <w:t>qa_cmd</w:t>
-      </w:r>
-      <w:proofErr w:type="spellEnd"/>
-      <w:r>
-        <w:t xml:space="preserve"> and provide its supporting files. And then provide the model id in the </w:t>
-      </w:r>
-      <w:proofErr w:type="spellStart"/>
-      <w:r>
-        <w:t>nuqa</w:t>
-      </w:r>
-      <w:proofErr w:type="spellEnd"/>
-      <w:r>
-        <w:t xml:space="preserve"> command in the bat file</w:t>
+        <w:rPr>
+          <w:lang w:val="en-US"/>
+        </w:rPr>
+        <w:t>common\python\python3.10\win64</w:t>
+      </w:r>
+      <w:r>
+        <w:rPr>
+          <w:lang w:val="en-US"/>
+        </w:rPr>
+        <w:t xml:space="preserve">\python.exe -m </w:t>
+      </w:r>
+      <w:proofErr w:type="spellStart"/>
+      <w:r>
+        <w:rPr>
+          <w:lang w:val="en-US"/>
+        </w:rPr>
+        <w:t>venv</w:t>
+      </w:r>
+      <w:proofErr w:type="spellEnd"/>
+      <w:r>
+        <w:rPr>
+          <w:lang w:val="en-US"/>
+        </w:rPr>
+        <w:t xml:space="preserve"> </w:t>
+      </w:r>
+      <w:proofErr w:type="spellStart"/>
+      <w:r>
+        <w:rPr>
+          <w:lang w:val="en-US"/>
+        </w:rPr>
+        <w:t>AgentOptimiser</w:t>
+      </w:r>
+      <w:proofErr w:type="spellEnd"/>
+    </w:p>
+    <w:p>
+      <w:pPr>
+        <w:rPr>
+          <w:lang w:val="en-US"/>
+        </w:rPr>
+      </w:pPr>
+      <w:r>
+        <w:rPr>
+          <w:lang w:val="en-US"/>
+        </w:rPr>
+        <w:t>This will create a virtual environment where we can install new modules as necessary</w:t>
+      </w:r>
+    </w:p>
+    <w:p>
+      <w:pPr>
+        <w:rPr>
+          <w:lang w:val="en-US"/>
+        </w:rPr>
+      </w:pPr>
+      <w:proofErr w:type="spellStart"/>
+      <w:r>
+        <w:rPr>
+          <w:lang w:val="en-US"/>
+        </w:rPr>
+        <w:t>AgentOptimiser</w:t>
+      </w:r>
+      <w:proofErr w:type="spellEnd"/>
+      <w:r>
+        <w:rPr>
+          <w:lang w:val="en-US"/>
+        </w:rPr>
+        <w:t>\scripts\activate</w:t>
+      </w:r>
+    </w:p>
+    <w:p>
+      <w:pPr>
+        <w:rPr>
+          <w:lang w:val="en-US"/>
+        </w:rPr>
+      </w:pPr>
+      <w:r>
+        <w:rPr>
+          <w:lang w:val="en-US"/>
+        </w:rPr>
+        <w:t>This will start the virtual environment</w:t>
+      </w:r>
+    </w:p>
+    <w:p>
+      <w:pPr>
+        <w:rPr>
+          <w:lang w:val="en-US"/>
+        </w:rPr>
+      </w:pPr>
+      <w:r>
+        <w:rPr>
+          <w:lang w:val="en-US"/>
+        </w:rPr>
+        <w:t xml:space="preserve">Pip install </w:t>
+      </w:r>
+      <w:proofErr w:type="spellStart"/>
+      <w:r>
+        <w:rPr>
+          <w:lang w:val="en-US"/>
+        </w:rPr>
+        <w:t>lxml</w:t>
+      </w:r>
+      <w:proofErr w:type="spellEnd"/>
+      <w:r>
+        <w:rPr>
+          <w:lang w:val="en-US"/>
+        </w:rPr>
+        <w:t xml:space="preserve">, </w:t>
+      </w:r>
+      <w:proofErr w:type="spellStart"/>
+      <w:r>
+        <w:rPr>
+          <w:lang w:val="en-US"/>
+        </w:rPr>
+        <w:t>websockets</w:t>
+      </w:r>
+      <w:proofErr w:type="spellEnd"/>
+    </w:p>
+    <w:p>
+      <w:pPr>
+        <w:rPr>
+          <w:lang w:val="en-US"/>
+        </w:rPr>
+      </w:pPr>
+      <w:r>
+        <w:rPr>
+          <w:lang w:val="en-US"/>
+        </w:rPr>
+        <w:t>Python &lt;</w:t>
+      </w:r>
+      <w:proofErr w:type="spellStart"/>
+      <w:r>
+        <w:rPr>
+          <w:lang w:val="en-US"/>
+        </w:rPr>
+        <w:t>dir</w:t>
+      </w:r>
+      <w:proofErr w:type="spellEnd"/>
+      <w:r>
+        <w:rPr>
+          <w:lang w:val="en-US"/>
+        </w:rPr>
+        <w:t>&gt;\</w:t>
+      </w:r>
+      <w:r>
+        <w:rPr>
+          <w:lang w:val="en-US"/>
+        </w:rPr>
+        <w:t>client.py</w:t>
+      </w:r>
+    </w:p>
+    <w:p>
+      <w:pPr>
+        <w:rPr>
+          <w:lang w:val="en-US"/>
+        </w:rPr>
+      </w:pPr>
+      <w:r>
+        <w:rPr>
+          <w:lang w:val="en-US"/>
+        </w:rPr>
+        <w:lastRenderedPageBreak/>
+        <w:t xml:space="preserve">This will </w:t>
+      </w:r>
+      <w:proofErr w:type="gramStart"/>
+      <w:r>
+        <w:rPr>
+          <w:lang w:val="en-US"/>
+        </w:rPr>
+        <w:t>start</w:t>
+      </w:r>
+      <w:proofErr w:type="gramEnd"/>
+      <w:r>
+        <w:rPr>
+          <w:lang w:val="en-US"/>
+        </w:rPr>
+        <w:t xml:space="preserve"> a persistent </w:t>
+      </w:r>
+      <w:proofErr w:type="spellStart"/>
+      <w:r>
+        <w:rPr>
+          <w:lang w:val="en-US"/>
+        </w:rPr>
+        <w:t>websocket</w:t>
+      </w:r>
+      <w:proofErr w:type="spellEnd"/>
+      <w:r>
+        <w:rPr>
+          <w:lang w:val="en-US"/>
+        </w:rPr>
+        <w:t xml:space="preserve"> connected to </w:t>
+      </w:r>
+      <w:r>
+        <w:rPr>
+          <w:lang w:val="en-US"/>
+        </w:rPr>
+        <w:t>10.75.32.62</w:t>
+      </w:r>
+      <w:r>
+        <w:rPr>
+          <w:lang w:val="en-US"/>
+        </w:rPr>
+        <w:t>.</w:t>
       </w:r>
     </w:p>
     <w:p>
@@ -6156,6 +6516,79 @@
       </w:pPr>
       <w:r>
         <w:t xml:space="preserve">Final command </w:t>
+      </w:r>
+    </w:p>
+    <w:p>
+      <w:r>
+        <w:t>Before running the final command points to remember</w:t>
+      </w:r>
+    </w:p>
+    <w:p>
+      <w:pPr>
+        <w:pStyle w:val="ListParagraph"/>
+        <w:numPr>
+          <w:ilvl w:val="0"/>
+          <w:numId w:val="3"/>
+        </w:numPr>
+      </w:pPr>
+      <w:r>
+        <w:t xml:space="preserve">Update </w:t>
+      </w:r>
+      <w:proofErr w:type="spellStart"/>
+      <w:r>
+        <w:t>session_work_dir</w:t>
+      </w:r>
+      <w:proofErr w:type="spellEnd"/>
+      <w:r>
+        <w:t xml:space="preserve"> in python function </w:t>
+      </w:r>
+      <w:proofErr w:type="spellStart"/>
+      <w:r>
+        <w:t>analyze_simulation_results</w:t>
+      </w:r>
+      <w:proofErr w:type="spellEnd"/>
+    </w:p>
+    <w:p>
+      <w:pPr>
+        <w:pStyle w:val="ListParagraph"/>
+        <w:numPr>
+          <w:ilvl w:val="0"/>
+          <w:numId w:val="3"/>
+        </w:numPr>
+      </w:pPr>
+      <w:r>
+        <w:t xml:space="preserve">Update paths in </w:t>
+      </w:r>
+      <w:r>
+        <w:t>setup_and_run_nuqa_env.bat</w:t>
+      </w:r>
+    </w:p>
+    <w:p>
+      <w:pPr>
+        <w:pStyle w:val="ListParagraph"/>
+        <w:numPr>
+          <w:ilvl w:val="0"/>
+          <w:numId w:val="3"/>
+        </w:numPr>
+      </w:pPr>
+      <w:r>
+        <w:t xml:space="preserve">Start </w:t>
+      </w:r>
+      <w:proofErr w:type="spellStart"/>
+      <w:r>
+        <w:t>websocket</w:t>
+      </w:r>
+      <w:proofErr w:type="spellEnd"/>
+      <w:r>
+        <w:t xml:space="preserve"> if you intend to run </w:t>
+      </w:r>
+      <w:proofErr w:type="spellStart"/>
+      <w:r>
+        <w:t>py</w:t>
+      </w:r>
+      <w:proofErr w:type="spellEnd"/>
+      <w:r>
+        <w:t xml:space="preserve"> functions</w:t>
       </w:r>
     </w:p>
     <w:p>
@@ -6310,9 +6743,9 @@
 <file path=word/numbering.xml><?xml version="1.0" encoding="utf-8"?>
 <w:numbering xmlns:wpc="http://schemas.microsoft.com/office/word/2010/wordprocessingCanvas" xmlns:cx="http://schemas.microsoft.com/office/drawing/2014/chartex" xmlns:cx1="http://schemas.microsoft.com/office/drawing/2015/9/8/chartex" xmlns:cx2="http://schemas.microsoft.com/office/drawing/2015/10/21/chartex" xmlns:cx3="http://schemas.microsoft.com/office/drawing/2016/5/9/chartex" xmlns:cx4="http://schemas.microsoft.com/office/drawing/2016/5/10/chartex" xmlns:cx5="http://schemas.microsoft.com/office/drawing/2016/5/11/chartex" xmlns:cx6="http://schemas.microsoft.com/office/drawing/2016/5/12/chartex" xmlns:cx7="http://schemas.microsoft.com/office/drawing/2016/5/13/chartex" xmlns:cx8="http://schemas.microsoft.com/office/drawing/2016/5/14/chartex" xmlns:mc="http://schemas.openxmlformats.org/markup-compatibility/2006" xmlns:aink="http://schemas.microsoft.com/office/drawing/2016/ink" xmlns:am3d="http://schemas.microsoft.com/office/drawing/2017/model3d" xmlns:o="urn:schemas-microsoft-com:office:office" xmlns:oel="http://schemas.microsoft.com/office/2019/extlst" xmlns:r="http://schemas.openxmlformats.org/officeDocument/2006/relationships" xmlns:m="http://schemas.openxmlformats.org/officeDocument/2006/math" xmlns:v="urn:schemas-microsoft-com:vml" xmlns:wp14="http://schemas.microsoft.com/office/word/2010/wordprocessingDrawing" xmlns:wp="http://schemas.openxmlformats.org/drawingml/2006/wordprocessingDrawing" xmlns:w10="urn:schemas-microsoft-com:office:word" xmlns:w="http://schemas.openxmlformats.org/wordprocessingml/2006/main" xmlns:w14="http://schemas.microsoft.com/office/word/2010/wordml" xmlns:w15="http://schemas.microsoft.com/office/word/2012/wordml" xmlns:w16cex="http://schemas.microsoft.com/office/word/2018/wordml/cex" xmlns:w16cid="http://schemas.microsoft.com/office/word/2016/wordml/cid" xmlns:w16="http://schemas.microsoft.com/office/word/2018/wordml" xmlns:w16du="http://schemas.microsoft.com/office/word/2023/wordml/word16du" xmlns:w16sdtdh="http://schemas.microsoft.com/office/word/2020/wordml/sdtdatahash" xmlns:w16sdtfl="http://schemas.microsoft.com/office/word/2024/wordml/sdtformatlock" xmlns:w16se="http://schemas.microsoft.com/office/word/2015/wordml/symex" xmlns:wpg="http://schemas.microsoft.com/office/word/2010/wordprocessingGroup" xmlns:wpi="http://schemas.microsoft.com/office/word/2010/wordprocessingInk" xmlns:wne="http://schemas.microsoft.com/office/word/2006/wordml" xmlns:wps="http://schemas.microsoft.com/office/word/2010/wordprocessingShape" mc:Ignorable="w14 w15 w16se w16cid w16 w16cex w16sdtdh w16sdtfl w16du wp14">
   <w:abstractNum w:abstractNumId="0" w15:restartNumberingAfterBreak="0">
-    <w:nsid w:val="16F3290F"/>
+    <w:nsid w:val="06F50BEE"/>
     <w:multiLevelType w:val="hybridMultilevel"/>
-    <w:tmpl w:val="D79406DC"/>
+    <w:tmpl w:val="55AE7376"/>
     <w:lvl w:ilvl="0" w:tplc="4009000F">
       <w:start w:val="1"/>
       <w:numFmt w:val="decimal"/>
@@ -6399,9 +6832,9 @@
     </w:lvl>
   </w:abstractNum>
   <w:abstractNum w:abstractNumId="1" w15:restartNumberingAfterBreak="0">
-    <w:nsid w:val="4155163B"/>
+    <w:nsid w:val="16F3290F"/>
     <w:multiLevelType w:val="hybridMultilevel"/>
-    <w:tmpl w:val="637AA680"/>
+    <w:tmpl w:val="D79406DC"/>
     <w:lvl w:ilvl="0" w:tplc="4009000F">
       <w:start w:val="1"/>
       <w:numFmt w:val="decimal"/>
@@ -6487,11 +6920,103 @@
       </w:pPr>
     </w:lvl>
   </w:abstractNum>
+  <w:abstractNum w:abstractNumId="2" w15:restartNumberingAfterBreak="0">
+    <w:nsid w:val="4155163B"/>
+    <w:multiLevelType w:val="hybridMultilevel"/>
+    <w:tmpl w:val="637AA680"/>
+    <w:lvl w:ilvl="0" w:tplc="4009000F">
+      <w:start w:val="1"/>
+      <w:numFmt w:val="decimal"/>
+      <w:lvlText w:val="%1."/>
+      <w:lvlJc w:val="left"/>
+      <w:pPr>
+        <w:ind w:left="720" w:hanging="360"/>
+      </w:pPr>
+      <w:rPr>
+        <w:rFonts w:hint="default"/>
+      </w:rPr>
+    </w:lvl>
+    <w:lvl w:ilvl="1" w:tplc="40090019" w:tentative="1">
+      <w:start w:val="1"/>
+      <w:numFmt w:val="lowerLetter"/>
+      <w:lvlText w:val="%2."/>
+      <w:lvlJc w:val="left"/>
+      <w:pPr>
+        <w:ind w:left="1440" w:hanging="360"/>
+      </w:pPr>
+    </w:lvl>
+    <w:lvl w:ilvl="2" w:tplc="4009001B" w:tentative="1">
+      <w:start w:val="1"/>
+      <w:numFmt w:val="lowerRoman"/>
+      <w:lvlText w:val="%3."/>
+      <w:lvlJc w:val="right"/>
+      <w:pPr>
+        <w:ind w:left="2160" w:hanging="180"/>
+      </w:pPr>
+    </w:lvl>
+    <w:lvl w:ilvl="3" w:tplc="4009000F" w:tentative="1">
+      <w:start w:val="1"/>
+      <w:numFmt w:val="decimal"/>
+      <w:lvlText w:val="%4."/>
+      <w:lvlJc w:val="left"/>
+      <w:pPr>
+        <w:ind w:left="2880" w:hanging="360"/>
+      </w:pPr>
+    </w:lvl>
+    <w:lvl w:ilvl="4" w:tplc="40090019" w:tentative="1">
+      <w:start w:val="1"/>
+      <w:numFmt w:val="lowerLetter"/>
+      <w:lvlText w:val="%5."/>
+      <w:lvlJc w:val="left"/>
+      <w:pPr>
+        <w:ind w:left="3600" w:hanging="360"/>
+      </w:pPr>
+    </w:lvl>
+    <w:lvl w:ilvl="5" w:tplc="4009001B" w:tentative="1">
+      <w:start w:val="1"/>
+      <w:numFmt w:val="lowerRoman"/>
+      <w:lvlText w:val="%6."/>
+      <w:lvlJc w:val="right"/>
+      <w:pPr>
+        <w:ind w:left="4320" w:hanging="180"/>
+      </w:pPr>
+    </w:lvl>
+    <w:lvl w:ilvl="6" w:tplc="4009000F" w:tentative="1">
+      <w:start w:val="1"/>
+      <w:numFmt w:val="decimal"/>
+      <w:lvlText w:val="%7."/>
+      <w:lvlJc w:val="left"/>
+      <w:pPr>
+        <w:ind w:left="5040" w:hanging="360"/>
+      </w:pPr>
+    </w:lvl>
+    <w:lvl w:ilvl="7" w:tplc="40090019" w:tentative="1">
+      <w:start w:val="1"/>
+      <w:numFmt w:val="lowerLetter"/>
+      <w:lvlText w:val="%8."/>
+      <w:lvlJc w:val="left"/>
+      <w:pPr>
+        <w:ind w:left="5760" w:hanging="360"/>
+      </w:pPr>
+    </w:lvl>
+    <w:lvl w:ilvl="8" w:tplc="4009001B" w:tentative="1">
+      <w:start w:val="1"/>
+      <w:numFmt w:val="lowerRoman"/>
+      <w:lvlText w:val="%9."/>
+      <w:lvlJc w:val="right"/>
+      <w:pPr>
+        <w:ind w:left="6480" w:hanging="180"/>
+      </w:pPr>
+    </w:lvl>
+  </w:abstractNum>
   <w:num w:numId="1" w16cid:durableId="1870026770">
-    <w:abstractNumId w:val="0"/>
+    <w:abstractNumId w:val="1"/>
   </w:num>
   <w:num w:numId="2" w16cid:durableId="943079258">
-    <w:abstractNumId w:val="1"/>
+    <w:abstractNumId w:val="2"/>
+  </w:num>
+  <w:num w:numId="3" w16cid:durableId="193813517">
+    <w:abstractNumId w:val="0"/>
   </w:num>
 </w:numbering>
 </file>
@@ -6896,7 +7421,7 @@
   <w:style w:type="paragraph" w:default="1" w:styleId="Normal">
     <w:name w:val="Normal"/>
     <w:qFormat/>
-    <w:rsid w:val="0023058B"/>
+    <w:rsid w:val="0009028E"/>
   </w:style>
   <w:style w:type="paragraph" w:styleId="Heading1">
     <w:name w:val="heading 1"/>

</xml_diff>